<commit_message>
Netinho: revisão da Parte 4
Co-Authored-By: Claude Opus 5.5 <noreply@anthropic.com>
Claude-Session: https://claude.ai/code/session_01MJjUEEZrxQDEUifKK2vj9g
</commit_message>
<xml_diff>
--- a/roteiros/netinho/Netinho_Parte4.docx
+++ b/roteiros/netinho/Netinho_Parte4.docx
@@ -39,7 +39,7 @@
         <w:rPr>
           <w:color w:val="000000"/>
         </w:rPr>
-        <w:t>Um câncer que ataca o sistema linfático, a rede de defesa do corpo. Não era uma sequela de dois mil e treze. Era uma doença nova. E, segundo o próprio Netinho contaria depois, um tipo raro.</w:t>
+        <w:t>Um câncer que ataca o sistema linfático, a rede de defesa do corpo. Não era uma sequela de dois mil e treze. Era uma doença nova. E, segundo a imprensa, de um tipo raro.</w:t>
       </w:r>
     </w:p>
     <w:p>
@@ -55,7 +55,7 @@
         <w:rPr>
           <w:color w:val="000000"/>
         </w:rPr>
-        <w:t>Qualquer pessoa teria se escondido. O Netinho fez o contrário.</w:t>
+        <w:t>Muita gente, no lugar dele, teria preferido enfrentar tudo em silêncio. O Netinho, depois daquelas primeiras semanas de segredo, fez o contrário.</w:t>
       </w:r>
     </w:p>
     <w:p>
@@ -71,7 +71,7 @@
         <w:rPr>
           <w:color w:val="000000"/>
         </w:rPr>
-        <w:t>Quinze de abril de dois mil e vinte e cinco. Ainda internado no Hospital Aliança Star, ele publicou uma atualização que parecia de quem estava comemorando uma vitória num jogo de futebol.</w:t>
+        <w:t>Quinze de abril de dois mil e vinte e cinco. Ainda internado no Hospital Aliança Star, ele publicou uma atualização que mostrava exatamente quem ele era.</w:t>
       </w:r>
     </w:p>
     <w:p>
@@ -143,7 +143,7 @@
         <w:rPr>
           <w:color w:val="000000"/>
         </w:rPr>
-        <w:t>Vinte e quatro de setembro de dois mil e vinte e cinco. Netinho publicou um texto que fez os fãs chorarem. Mas, dessa vez, de alegria.</w:t>
+        <w:t>Vinte e quatro de setembro de dois mil e vinte e cinco. Netinho publicou o texto que os fãs esperavam havia meses.</w:t>
       </w:r>
     </w:p>
     <w:p>
@@ -183,7 +183,7 @@
         <w:rPr>
           <w:color w:val="000000"/>
         </w:rPr>
-        <w:t>E fechou com uma frase que resume a fé que carregou até o fim. "Deus está vivo e tudo pode!"</w:t>
+        <w:t>E fechou com uma frase que resume a fé dele. "Deus está vivo e tudo pode!"</w:t>
       </w:r>
     </w:p>
     <w:p>
@@ -271,7 +271,7 @@
         <w:rPr>
           <w:color w:val="000000"/>
         </w:rPr>
-        <w:t>Rim. Guarde essa palavra. Porque ela ia aparecer de novo, cinco meses depois, na nota mais triste da vida dele.</w:t>
+        <w:t>Os rins. Guarde isso. Porque, cinco meses depois, eles iam aparecer de novo, na nota mais triste da vida dele.</w:t>
       </w:r>
     </w:p>
     <w:p>
@@ -319,7 +319,7 @@
         <w:rPr>
           <w:color w:val="000000"/>
         </w:rPr>
-        <w:t>Repara como, em treze anos, a frase quase não mudou. Está tudo certo, em dois mil e quinze. Está tudo certo, em dois mil e vinte e cinco. Vai dar tudo certo de novo, em dois mil e vinte e seis.</w:t>
+        <w:t>Repara como, em onze anos, a frase quase não mudou. Está tudo certo, em dois mil e quinze. Está tudo certo, em dois mil e vinte e cinco. Vai dar tudo certo de novo, em dois mil e vinte e seis.</w:t>
       </w:r>
     </w:p>
     <w:p>

</xml_diff>